<commit_message>
Inserção no relatório R de justificativa das KPIs utilizadas
</commit_message>
<xml_diff>
--- a/Analise Exploratória - Sagitário.docx
+++ b/Analise Exploratória - Sagitário.docx
@@ -7360,9 +7360,18 @@
           <w:szCs w:val="24"/>
         </w:rPr>
       </w:pPr>
-    </w:p>
-    <w:p>
-      <w:pPr>
+      <w:r>
+        <w:rPr>
+          <w:rFonts w:ascii="Arial" w:hAnsi="Arial" w:cs="Arial"/>
+          <w:sz w:val="24"/>
+          <w:szCs w:val="24"/>
+        </w:rPr>
+        <w:t>4. Indicadores Essenciais</w:t>
+      </w:r>
+    </w:p>
+    <w:p>
+      <w:pPr>
+        <w:ind w:firstLine="708"/>
         <w:jc w:val="both"/>
         <w:rPr>
           <w:rFonts w:ascii="Arial" w:hAnsi="Arial" w:cs="Arial"/>
@@ -7376,8 +7385,128 @@
           <w:sz w:val="24"/>
           <w:szCs w:val="24"/>
         </w:rPr>
+        <w:t>A análise exploratória demonstra que falhas operacionais não são eventos aleatórios, mas processos visíveis de degradação, como o crescimento linear previsível da memória RAM observado entre os dias 11 e 15 de março. Identificar ambientes com maior risco de colapso, a exemplo do servidor que atingiu picos de 99% de CPU e uma "explosão" de mais de 400 processos ativos no dia 16 de março, justifica a implementação de KPIs que monitorem anomalias em estágios iniciais de severidade. Esse monitoramento direcionado permite intervenções rápidas antes que o esgotamento de recursos comprometa o gerenciamento do espaço aéreo.</w:t>
+      </w:r>
+    </w:p>
+    <w:p>
+      <w:pPr>
+        <w:ind w:firstLine="708"/>
+        <w:jc w:val="both"/>
+        <w:rPr>
+          <w:rFonts w:ascii="Arial" w:hAnsi="Arial" w:cs="Arial"/>
+          <w:sz w:val="24"/>
+          <w:szCs w:val="24"/>
+        </w:rPr>
+      </w:pPr>
+      <w:r>
+        <w:rPr>
+          <w:rFonts w:ascii="Arial" w:hAnsi="Arial" w:cs="Arial"/>
+          <w:sz w:val="24"/>
+          <w:szCs w:val="24"/>
+        </w:rPr>
+        <w:t xml:space="preserve">O objetivo primordial dessas métricas é aumentar o tempo operacional e a confiabilidade da empresa, visto que a estabilidade do hardware é diretamente proporcional à segurança operacional. Ao evitar que o sistema atinja o nível </w:t>
+      </w:r>
+      <w:r>
+        <w:rPr>
+          <w:rFonts w:ascii="Arial" w:hAnsi="Arial" w:cs="Arial"/>
+          <w:sz w:val="24"/>
+          <w:szCs w:val="24"/>
+        </w:rPr>
+        <w:lastRenderedPageBreak/>
+        <w:t>crítico</w:t>
+      </w:r>
+      <w:r>
+        <w:rPr>
+          <w:rFonts w:ascii="Arial" w:hAnsi="Arial" w:cs="Arial"/>
+          <w:sz w:val="24"/>
+          <w:szCs w:val="24"/>
+        </w:rPr>
+        <w:t>,</w:t>
+      </w:r>
+      <w:r>
+        <w:rPr>
+          <w:rFonts w:ascii="Arial" w:hAnsi="Arial" w:cs="Arial"/>
+          <w:sz w:val="24"/>
+          <w:szCs w:val="24"/>
+        </w:rPr>
+        <w:t xml:space="preserve"> onde a latência chegou a quase 1 segundo (984ms), as KPIs mitigam custos vultosos relacionados ao consumo excedente de combustível, emissões de CO2 e multas por descumprimento de SLA. Além disso, o monitoramento financeiro constante protege o valor de mercado da organização, prevenindo quedas em ações e prejuízos com o estorno de passagens causados por atrasos sistêmicos.</w:t>
+      </w:r>
+    </w:p>
+    <w:p>
+      <w:pPr>
+        <w:ind w:firstLine="708"/>
+        <w:jc w:val="both"/>
+        <w:rPr>
+          <w:rFonts w:ascii="Arial" w:hAnsi="Arial" w:cs="Arial"/>
+          <w:sz w:val="24"/>
+          <w:szCs w:val="24"/>
+        </w:rPr>
+      </w:pPr>
+      <w:r>
+        <w:rPr>
+          <w:rFonts w:ascii="Arial" w:hAnsi="Arial" w:cs="Arial"/>
+          <w:sz w:val="24"/>
+          <w:szCs w:val="24"/>
+        </w:rPr>
+        <w:t>Em</w:t>
+      </w:r>
+      <w:r>
+        <w:rPr>
+          <w:rFonts w:ascii="Arial" w:hAnsi="Arial" w:cs="Arial"/>
+          <w:sz w:val="24"/>
+          <w:szCs w:val="24"/>
+        </w:rPr>
+        <w:t xml:space="preserve"> casos de colapso sistêmico, </w:t>
+      </w:r>
+      <w:r>
+        <w:rPr>
+          <w:rFonts w:ascii="Arial" w:hAnsi="Arial" w:cs="Arial"/>
+          <w:sz w:val="24"/>
+          <w:szCs w:val="24"/>
+        </w:rPr>
+        <w:t>os indicadores de dias críticos e servidores com maior número de incidentes</w:t>
+      </w:r>
+      <w:r>
+        <w:rPr>
+          <w:rFonts w:ascii="Arial" w:hAnsi="Arial" w:cs="Arial"/>
+          <w:sz w:val="24"/>
+          <w:szCs w:val="24"/>
+        </w:rPr>
+        <w:t xml:space="preserve"> garantem que o tempo de recuperação possa ser mensurado e avaliado para prevenir recorrências. A análise técnica do incidente do dia 16 revelou que, mesmo após a resolução aparente, o sistema manteve marcas persistentes de performance, como a memória Swap travada em 100% e um leve aumento na latência residual. Portanto, medir a eficiência da recuperação é essencial para assegurar que o servidor retorne ao seu equilíbrio real e continue a processar dados críticos em milissegundos, mantendo a integridade total do sistema Sagitário.</w:t>
+      </w:r>
+    </w:p>
+    <w:p>
+      <w:pPr>
+        <w:jc w:val="both"/>
+        <w:rPr>
+          <w:rFonts w:ascii="Arial" w:hAnsi="Arial" w:cs="Arial"/>
+          <w:sz w:val="24"/>
+          <w:szCs w:val="24"/>
+        </w:rPr>
+      </w:pPr>
+      <w:r>
+        <w:rPr>
+          <w:rFonts w:ascii="Arial" w:hAnsi="Arial" w:cs="Arial"/>
+          <w:sz w:val="24"/>
+          <w:szCs w:val="24"/>
+        </w:rPr>
         <w:tab/>
-        <w:t>O monitoramento da infraestrutura do Sagitário é o que garante a alta disponibilidade necessária para a segurança aérea. Esta análise provou que falhas de recursos não são eventos aleatórios, mas processos visíveis. Implementar níveis de severidade baseados nos limites de uso</w:t>
+      </w:r>
+      <w:r>
+        <w:rPr>
+          <w:rFonts w:ascii="Arial" w:hAnsi="Arial" w:cs="Arial"/>
+          <w:sz w:val="24"/>
+          <w:szCs w:val="24"/>
+        </w:rPr>
+        <w:t>Por fim, o</w:t>
+      </w:r>
+      <w:r>
+        <w:rPr>
+          <w:rFonts w:ascii="Arial" w:hAnsi="Arial" w:cs="Arial"/>
+          <w:sz w:val="24"/>
+          <w:szCs w:val="24"/>
+        </w:rPr>
+        <w:t xml:space="preserve"> monitoramento da infraestrutura do Sagitário é o que garante a alta disponibilidade necessária para a segurança aérea. Esta análise provou que falhas de recursos não são eventos aleatórios, mas processos visíveis. Implementar níveis de severidade baseados nos limites de uso</w:t>
       </w:r>
       <w:r>
         <w:rPr>
@@ -9072,7 +9201,6 @@
   <w:style w:type="character" w:default="1" w:styleId="Fontepargpadro">
     <w:name w:val="Default Paragraph Font"/>
     <w:uiPriority w:val="1"/>
-    <w:semiHidden/>
     <w:unhideWhenUsed/>
   </w:style>
   <w:style w:type="table" w:default="1" w:styleId="Tabelanormal">

</xml_diff>

<commit_message>
Modificações pós-sprint e criação de diretório para redes
</commit_message>
<xml_diff>
--- a/Analise Exploratória - Sagitário.docx
+++ b/Analise Exploratória - Sagitário.docx
@@ -1267,29 +1267,7 @@
           <w:sz w:val="20"/>
           <w:szCs w:val="20"/>
         </w:rPr>
-        <w:t xml:space="preserve"> – </w:t>
-      </w:r>
-      <w:proofErr w:type="gramStart"/>
-      <w:r>
-        <w:rPr>
-          <w:rFonts w:ascii="Arial" w:hAnsi="Arial" w:cs="Arial"/>
-          <w:b/>
-          <w:bCs/>
-          <w:sz w:val="20"/>
-          <w:szCs w:val="20"/>
-        </w:rPr>
-        <w:t>CPU(</w:t>
-      </w:r>
-      <w:proofErr w:type="gramEnd"/>
-      <w:r>
-        <w:rPr>
-          <w:rFonts w:ascii="Arial" w:hAnsi="Arial" w:cs="Arial"/>
-          <w:b/>
-          <w:bCs/>
-          <w:sz w:val="20"/>
-          <w:szCs w:val="20"/>
-        </w:rPr>
-        <w:t>%)</w:t>
+        <w:t xml:space="preserve"> – CPU(%)</w:t>
       </w:r>
     </w:p>
     <w:p>
@@ -1421,7 +1399,6 @@
         </w:rPr>
         <w:t xml:space="preserve"> e do </w:t>
       </w:r>
-      <w:proofErr w:type="spellStart"/>
       <w:r>
         <w:rPr>
           <w:rFonts w:ascii="Arial" w:eastAsiaTheme="majorEastAsia" w:hAnsi="Arial" w:cs="Arial"/>
@@ -1433,7 +1410,6 @@
         </w:rPr>
         <w:t>plot</w:t>
       </w:r>
-      <w:proofErr w:type="spellEnd"/>
       <w:r>
         <w:rPr>
           <w:rFonts w:ascii="Arial" w:eastAsiaTheme="majorEastAsia" w:hAnsi="Arial" w:cs="Arial"/>
@@ -1814,7 +1790,6 @@
         </w:rPr>
         <w:t xml:space="preserve"> – </w:t>
       </w:r>
-      <w:proofErr w:type="gramStart"/>
       <w:r>
         <w:rPr>
           <w:rFonts w:ascii="Arial" w:hAnsi="Arial" w:cs="Arial"/>
@@ -1833,18 +1808,7 @@
           <w:sz w:val="20"/>
           <w:szCs w:val="20"/>
         </w:rPr>
-        <w:t>(</w:t>
-      </w:r>
-      <w:proofErr w:type="gramEnd"/>
-      <w:r>
-        <w:rPr>
-          <w:rFonts w:ascii="Arial" w:hAnsi="Arial" w:cs="Arial"/>
-          <w:b/>
-          <w:bCs/>
-          <w:sz w:val="20"/>
-          <w:szCs w:val="20"/>
-        </w:rPr>
-        <w:t>%)</w:t>
+        <w:t>(%)</w:t>
       </w:r>
     </w:p>
     <w:p>
@@ -2167,7 +2131,6 @@
         </w:rPr>
         <w:t xml:space="preserve"> – </w:t>
       </w:r>
-      <w:proofErr w:type="gramStart"/>
       <w:r>
         <w:rPr>
           <w:rFonts w:ascii="Arial" w:hAnsi="Arial" w:cs="Arial"/>
@@ -2186,18 +2149,7 @@
           <w:sz w:val="20"/>
           <w:szCs w:val="20"/>
         </w:rPr>
-        <w:t>(</w:t>
-      </w:r>
-      <w:proofErr w:type="gramEnd"/>
-      <w:r>
-        <w:rPr>
-          <w:rFonts w:ascii="Arial" w:hAnsi="Arial" w:cs="Arial"/>
-          <w:b/>
-          <w:bCs/>
-          <w:sz w:val="20"/>
-          <w:szCs w:val="20"/>
-        </w:rPr>
-        <w:t>%</w:t>
+        <w:t>(%</w:t>
       </w:r>
       <w:r>
         <w:rPr>
@@ -2430,7 +2382,6 @@
         </w:rPr>
         <w:t xml:space="preserve"> – </w:t>
       </w:r>
-      <w:proofErr w:type="gramStart"/>
       <w:r>
         <w:rPr>
           <w:rFonts w:ascii="Arial" w:hAnsi="Arial" w:cs="Arial"/>
@@ -2449,18 +2400,7 @@
           <w:sz w:val="20"/>
           <w:szCs w:val="20"/>
         </w:rPr>
-        <w:t>(</w:t>
-      </w:r>
-      <w:proofErr w:type="gramEnd"/>
-      <w:r>
-        <w:rPr>
-          <w:rFonts w:ascii="Arial" w:hAnsi="Arial" w:cs="Arial"/>
-          <w:b/>
-          <w:bCs/>
-          <w:sz w:val="20"/>
-          <w:szCs w:val="20"/>
-        </w:rPr>
-        <w:t>%</w:t>
+        <w:t>(%</w:t>
       </w:r>
       <w:r>
         <w:rPr>
@@ -2681,7 +2621,6 @@
         </w:rPr>
         <w:t xml:space="preserve">mais evidente no </w:t>
       </w:r>
-      <w:proofErr w:type="spellStart"/>
       <w:r>
         <w:rPr>
           <w:rFonts w:ascii="Arial" w:hAnsi="Arial" w:cs="Arial"/>
@@ -2692,7 +2631,6 @@
         </w:rPr>
         <w:t>plot</w:t>
       </w:r>
-      <w:proofErr w:type="spellEnd"/>
       <w:r>
         <w:rPr>
           <w:rFonts w:ascii="Arial" w:hAnsi="Arial" w:cs="Arial"/>
@@ -2861,7 +2799,6 @@
         </w:rPr>
         <w:t xml:space="preserve"> – </w:t>
       </w:r>
-      <w:proofErr w:type="gramStart"/>
       <w:r>
         <w:rPr>
           <w:rFonts w:ascii="Arial" w:hAnsi="Arial" w:cs="Arial"/>
@@ -2880,18 +2817,7 @@
           <w:sz w:val="20"/>
           <w:szCs w:val="20"/>
         </w:rPr>
-        <w:t>(</w:t>
-      </w:r>
-      <w:proofErr w:type="gramEnd"/>
-      <w:r>
-        <w:rPr>
-          <w:rFonts w:ascii="Arial" w:hAnsi="Arial" w:cs="Arial"/>
-          <w:b/>
-          <w:bCs/>
-          <w:sz w:val="20"/>
-          <w:szCs w:val="20"/>
-        </w:rPr>
-        <w:t>%</w:t>
+        <w:t>(%</w:t>
       </w:r>
       <w:r>
         <w:rPr>
@@ -3018,7 +2944,6 @@
         </w:rPr>
         <w:t xml:space="preserve"> – </w:t>
       </w:r>
-      <w:proofErr w:type="gramStart"/>
       <w:r>
         <w:rPr>
           <w:rFonts w:ascii="Arial" w:hAnsi="Arial" w:cs="Arial"/>
@@ -3037,18 +2962,7 @@
           <w:sz w:val="20"/>
           <w:szCs w:val="20"/>
         </w:rPr>
-        <w:t>(</w:t>
-      </w:r>
-      <w:proofErr w:type="gramEnd"/>
-      <w:r>
-        <w:rPr>
-          <w:rFonts w:ascii="Arial" w:hAnsi="Arial" w:cs="Arial"/>
-          <w:b/>
-          <w:bCs/>
-          <w:sz w:val="20"/>
-          <w:szCs w:val="20"/>
-        </w:rPr>
-        <w:t>%</w:t>
+        <w:t>(%</w:t>
       </w:r>
       <w:r>
         <w:rPr>
@@ -3165,7 +3079,6 @@
         </w:rPr>
         <w:t xml:space="preserve"> – </w:t>
       </w:r>
-      <w:proofErr w:type="gramStart"/>
       <w:r>
         <w:rPr>
           <w:rFonts w:ascii="Arial" w:hAnsi="Arial" w:cs="Arial"/>
@@ -3184,18 +3097,7 @@
           <w:sz w:val="20"/>
           <w:szCs w:val="20"/>
         </w:rPr>
-        <w:t>(</w:t>
-      </w:r>
-      <w:proofErr w:type="gramEnd"/>
-      <w:r>
-        <w:rPr>
-          <w:rFonts w:ascii="Arial" w:hAnsi="Arial" w:cs="Arial"/>
-          <w:b/>
-          <w:bCs/>
-          <w:sz w:val="20"/>
-          <w:szCs w:val="20"/>
-        </w:rPr>
-        <w:t>%</w:t>
+        <w:t>(%</w:t>
       </w:r>
       <w:r>
         <w:rPr>
@@ -3386,7 +3288,6 @@
         </w:rPr>
         <w:t xml:space="preserve"> – </w:t>
       </w:r>
-      <w:proofErr w:type="gramStart"/>
       <w:r>
         <w:rPr>
           <w:rFonts w:ascii="Arial" w:hAnsi="Arial" w:cs="Arial"/>
@@ -3405,18 +3306,7 @@
           <w:sz w:val="20"/>
           <w:szCs w:val="20"/>
         </w:rPr>
-        <w:t>(</w:t>
-      </w:r>
-      <w:proofErr w:type="gramEnd"/>
-      <w:r>
-        <w:rPr>
-          <w:rFonts w:ascii="Arial" w:hAnsi="Arial" w:cs="Arial"/>
-          <w:b/>
-          <w:bCs/>
-          <w:sz w:val="20"/>
-          <w:szCs w:val="20"/>
-        </w:rPr>
-        <w:t>%</w:t>
+        <w:t>(%</w:t>
       </w:r>
       <w:r>
         <w:rPr>
@@ -3651,20 +3541,8 @@
           <w:sz w:val="20"/>
           <w:szCs w:val="20"/>
         </w:rPr>
-        <w:t xml:space="preserve">Gráfico </w:t>
-      </w:r>
-      <w:proofErr w:type="spellStart"/>
-      <w:r>
-        <w:rPr>
-          <w:rFonts w:ascii="Arial" w:hAnsi="Arial" w:cs="Arial"/>
-          <w:b/>
-          <w:bCs/>
-          <w:sz w:val="20"/>
-          <w:szCs w:val="20"/>
-        </w:rPr>
-        <w:t>Boxplot</w:t>
-      </w:r>
-      <w:proofErr w:type="spellEnd"/>
+        <w:t>Gráfico Boxplot</w:t>
+      </w:r>
       <w:r>
         <w:rPr>
           <w:rFonts w:ascii="Arial" w:hAnsi="Arial" w:cs="Arial"/>
@@ -3675,7 +3553,6 @@
         </w:rPr>
         <w:t xml:space="preserve"> – </w:t>
       </w:r>
-      <w:proofErr w:type="gramStart"/>
       <w:r>
         <w:rPr>
           <w:rFonts w:ascii="Arial" w:hAnsi="Arial" w:cs="Arial"/>
@@ -3694,18 +3571,7 @@
           <w:sz w:val="20"/>
           <w:szCs w:val="20"/>
         </w:rPr>
-        <w:t>(</w:t>
-      </w:r>
-      <w:proofErr w:type="gramEnd"/>
-      <w:r>
-        <w:rPr>
-          <w:rFonts w:ascii="Arial" w:hAnsi="Arial" w:cs="Arial"/>
-          <w:b/>
-          <w:bCs/>
-          <w:sz w:val="20"/>
-          <w:szCs w:val="20"/>
-        </w:rPr>
-        <w:t>%</w:t>
+        <w:t>(%</w:t>
       </w:r>
       <w:r>
         <w:rPr>
@@ -3770,29 +3636,7 @@
           <w:sz w:val="24"/>
           <w:szCs w:val="24"/>
         </w:rPr>
-        <w:t xml:space="preserve">“Gráfico de Linha – </w:t>
-      </w:r>
-      <w:proofErr w:type="gramStart"/>
-      <w:r>
-        <w:rPr>
-          <w:rFonts w:ascii="Arial" w:hAnsi="Arial" w:cs="Arial"/>
-          <w:b/>
-          <w:bCs/>
-          <w:sz w:val="24"/>
-          <w:szCs w:val="24"/>
-        </w:rPr>
-        <w:t>RAM(</w:t>
-      </w:r>
-      <w:proofErr w:type="gramEnd"/>
-      <w:r>
-        <w:rPr>
-          <w:rFonts w:ascii="Arial" w:hAnsi="Arial" w:cs="Arial"/>
-          <w:b/>
-          <w:bCs/>
-          <w:sz w:val="24"/>
-          <w:szCs w:val="24"/>
-        </w:rPr>
-        <w:t>%)</w:t>
+        <w:t>“Gráfico de Linha – RAM(%)</w:t>
       </w:r>
       <w:r>
         <w:rPr>
@@ -3826,7 +3670,6 @@
         </w:rPr>
         <w:t xml:space="preserve">, evidenciando seu crescimento e seu ápice de forma clara. Dessa forma, tendo como base o </w:t>
       </w:r>
-      <w:proofErr w:type="spellStart"/>
       <w:r>
         <w:rPr>
           <w:rFonts w:ascii="Arial" w:hAnsi="Arial" w:cs="Arial"/>
@@ -3837,7 +3680,6 @@
         </w:rPr>
         <w:t>plot</w:t>
       </w:r>
-      <w:proofErr w:type="spellEnd"/>
       <w:r>
         <w:rPr>
           <w:rFonts w:ascii="Arial" w:hAnsi="Arial" w:cs="Arial"/>
@@ -3888,7 +3730,6 @@
         </w:rPr>
         <w:t xml:space="preserve">Além disso, foi realizada a observação do uso da memória swap ao longo do mês, na qual é possível notar o crescimento lento e contínuo, até chegar no dia 16 de março, onde ocorreu um salto abrupto, representando um evento (incidente) no servidor. Após isso, o uso de swap permaneceu em 100%, não retornando ao comportamento anterior. A diferença de comportamento da memória swap pode ser analisada também por meio de um </w:t>
       </w:r>
-      <w:proofErr w:type="spellStart"/>
       <w:r>
         <w:rPr>
           <w:rFonts w:ascii="Arial" w:hAnsi="Arial" w:cs="Arial"/>
@@ -3899,7 +3740,6 @@
         </w:rPr>
         <w:t>boxplot</w:t>
       </w:r>
-      <w:proofErr w:type="spellEnd"/>
       <w:r>
         <w:rPr>
           <w:rFonts w:ascii="Arial" w:hAnsi="Arial" w:cs="Arial"/>
@@ -4117,29 +3957,7 @@
           <w:sz w:val="20"/>
           <w:szCs w:val="20"/>
         </w:rPr>
-        <w:t>Latência (</w:t>
-      </w:r>
-      <w:proofErr w:type="spellStart"/>
-      <w:r>
-        <w:rPr>
-          <w:rFonts w:ascii="Arial" w:hAnsi="Arial" w:cs="Arial"/>
-          <w:b/>
-          <w:bCs/>
-          <w:sz w:val="20"/>
-          <w:szCs w:val="20"/>
-        </w:rPr>
-        <w:t>ms</w:t>
-      </w:r>
-      <w:proofErr w:type="spellEnd"/>
-      <w:r>
-        <w:rPr>
-          <w:rFonts w:ascii="Arial" w:hAnsi="Arial" w:cs="Arial"/>
-          <w:b/>
-          <w:bCs/>
-          <w:sz w:val="20"/>
-          <w:szCs w:val="20"/>
-        </w:rPr>
-        <w:t>)</w:t>
+        <w:t>Latência (ms)</w:t>
       </w:r>
     </w:p>
     <w:p>
@@ -4313,29 +4131,7 @@
           <w:sz w:val="20"/>
           <w:szCs w:val="20"/>
         </w:rPr>
-        <w:t>Latência (</w:t>
-      </w:r>
-      <w:proofErr w:type="spellStart"/>
-      <w:r>
-        <w:rPr>
-          <w:rFonts w:ascii="Arial" w:hAnsi="Arial" w:cs="Arial"/>
-          <w:b/>
-          <w:bCs/>
-          <w:sz w:val="20"/>
-          <w:szCs w:val="20"/>
-        </w:rPr>
-        <w:t>ms</w:t>
-      </w:r>
-      <w:proofErr w:type="spellEnd"/>
-      <w:r>
-        <w:rPr>
-          <w:rFonts w:ascii="Arial" w:hAnsi="Arial" w:cs="Arial"/>
-          <w:b/>
-          <w:bCs/>
-          <w:sz w:val="20"/>
-          <w:szCs w:val="20"/>
-        </w:rPr>
-        <w:t>)</w:t>
+        <w:t>Latência (ms)</w:t>
       </w:r>
     </w:p>
     <w:p>
@@ -4581,51 +4377,7 @@
           <w:szCs w:val="20"/>
         </w:rPr>
         <w:lastRenderedPageBreak/>
-        <w:t xml:space="preserve">Gráfico </w:t>
-      </w:r>
-      <w:proofErr w:type="spellStart"/>
-      <w:r>
-        <w:rPr>
-          <w:rFonts w:ascii="Arial" w:hAnsi="Arial" w:cs="Arial"/>
-          <w:b/>
-          <w:bCs/>
-          <w:sz w:val="20"/>
-          <w:szCs w:val="20"/>
-        </w:rPr>
-        <w:t>Boxplot</w:t>
-      </w:r>
-      <w:proofErr w:type="spellEnd"/>
-      <w:r>
-        <w:rPr>
-          <w:rFonts w:ascii="Arial" w:hAnsi="Arial" w:cs="Arial"/>
-          <w:b/>
-          <w:bCs/>
-          <w:sz w:val="20"/>
-          <w:szCs w:val="20"/>
-        </w:rPr>
-        <w:t xml:space="preserve"> – Latência (</w:t>
-      </w:r>
-      <w:proofErr w:type="spellStart"/>
-      <w:r>
-        <w:rPr>
-          <w:rFonts w:ascii="Arial" w:hAnsi="Arial" w:cs="Arial"/>
-          <w:b/>
-          <w:bCs/>
-          <w:sz w:val="20"/>
-          <w:szCs w:val="20"/>
-        </w:rPr>
-        <w:t>ms</w:t>
-      </w:r>
-      <w:proofErr w:type="spellEnd"/>
-      <w:r>
-        <w:rPr>
-          <w:rFonts w:ascii="Arial" w:hAnsi="Arial" w:cs="Arial"/>
-          <w:b/>
-          <w:bCs/>
-          <w:sz w:val="20"/>
-          <w:szCs w:val="20"/>
-        </w:rPr>
-        <w:t>)</w:t>
+        <w:t>Gráfico Boxplot – Latência (ms)</w:t>
       </w:r>
     </w:p>
     <w:p>
@@ -4980,61 +4732,17 @@
           <w:sz w:val="20"/>
           <w:szCs w:val="20"/>
         </w:rPr>
-        <w:t>(</w:t>
-      </w:r>
-      <w:proofErr w:type="spellStart"/>
-      <w:r>
-        <w:rPr>
-          <w:rFonts w:ascii="Arial" w:hAnsi="Arial" w:cs="Arial"/>
-          <w:b/>
-          <w:bCs/>
-          <w:sz w:val="20"/>
-          <w:szCs w:val="20"/>
-        </w:rPr>
-        <w:t>ms</w:t>
-      </w:r>
-      <w:proofErr w:type="spellEnd"/>
-      <w:r>
-        <w:rPr>
-          <w:rFonts w:ascii="Arial" w:hAnsi="Arial" w:cs="Arial"/>
-          <w:b/>
-          <w:bCs/>
-          <w:sz w:val="20"/>
-          <w:szCs w:val="20"/>
-        </w:rPr>
-        <w:t>)</w:t>
-      </w:r>
-      <w:r>
-        <w:rPr>
-          <w:rFonts w:ascii="Arial" w:hAnsi="Arial" w:cs="Arial"/>
-          <w:b/>
-          <w:bCs/>
-          <w:sz w:val="20"/>
-          <w:szCs w:val="20"/>
-        </w:rPr>
-        <w:t xml:space="preserve"> e </w:t>
-      </w:r>
-      <w:proofErr w:type="gramStart"/>
-      <w:r>
-        <w:rPr>
-          <w:rFonts w:ascii="Arial" w:hAnsi="Arial" w:cs="Arial"/>
-          <w:b/>
-          <w:bCs/>
-          <w:sz w:val="20"/>
-          <w:szCs w:val="20"/>
-        </w:rPr>
-        <w:t>RAM(</w:t>
-      </w:r>
-      <w:proofErr w:type="gramEnd"/>
-      <w:r>
-        <w:rPr>
-          <w:rFonts w:ascii="Arial" w:hAnsi="Arial" w:cs="Arial"/>
-          <w:b/>
-          <w:bCs/>
-          <w:sz w:val="20"/>
-          <w:szCs w:val="20"/>
-        </w:rPr>
-        <w:t>%)</w:t>
+        <w:t>(ms)</w:t>
+      </w:r>
+      <w:r>
+        <w:rPr>
+          <w:rFonts w:ascii="Arial" w:hAnsi="Arial" w:cs="Arial"/>
+          <w:b/>
+          <w:bCs/>
+          <w:sz w:val="20"/>
+          <w:szCs w:val="20"/>
+        </w:rPr>
+        <w:t xml:space="preserve"> e RAM(%)</w:t>
       </w:r>
     </w:p>
     <w:p>
@@ -5720,7 +5428,6 @@
         </w:rPr>
         <w:t xml:space="preserve">Através do </w:t>
       </w:r>
-      <w:proofErr w:type="spellStart"/>
       <w:r>
         <w:rPr>
           <w:rFonts w:ascii="Arial" w:hAnsi="Arial" w:cs="Arial"/>
@@ -5731,7 +5438,6 @@
         </w:rPr>
         <w:t>boxplot</w:t>
       </w:r>
-      <w:proofErr w:type="spellEnd"/>
       <w:r>
         <w:rPr>
           <w:rFonts w:ascii="Arial" w:hAnsi="Arial" w:cs="Arial"/>
@@ -5845,7 +5551,6 @@
         </w:rPr>
         <w:t xml:space="preserve">Por meio do </w:t>
       </w:r>
-      <w:proofErr w:type="spellStart"/>
       <w:r>
         <w:rPr>
           <w:rFonts w:ascii="Arial" w:hAnsi="Arial" w:cs="Arial"/>
@@ -5856,7 +5561,6 @@
         </w:rPr>
         <w:t>plot</w:t>
       </w:r>
-      <w:proofErr w:type="spellEnd"/>
       <w:r>
         <w:rPr>
           <w:rFonts w:ascii="Arial" w:hAnsi="Arial" w:cs="Arial"/>
@@ -5926,29 +5630,7 @@
           <w:sz w:val="20"/>
           <w:szCs w:val="20"/>
         </w:rPr>
-        <w:t xml:space="preserve"> Quantidade de </w:t>
-      </w:r>
-      <w:proofErr w:type="spellStart"/>
-      <w:r>
-        <w:rPr>
-          <w:rFonts w:ascii="Arial" w:hAnsi="Arial" w:cs="Arial"/>
-          <w:b/>
-          <w:bCs/>
-          <w:sz w:val="20"/>
-          <w:szCs w:val="20"/>
-        </w:rPr>
-        <w:t>KiloBytes</w:t>
-      </w:r>
-      <w:proofErr w:type="spellEnd"/>
-      <w:r>
-        <w:rPr>
-          <w:rFonts w:ascii="Arial" w:hAnsi="Arial" w:cs="Arial"/>
-          <w:b/>
-          <w:bCs/>
-          <w:sz w:val="20"/>
-          <w:szCs w:val="20"/>
-        </w:rPr>
-        <w:t xml:space="preserve"> Enviados</w:t>
+        <w:t xml:space="preserve"> Quantidade de KiloBytes Enviados</w:t>
       </w:r>
     </w:p>
     <w:p>
@@ -6224,29 +5906,7 @@
           <w:sz w:val="20"/>
           <w:szCs w:val="20"/>
         </w:rPr>
-        <w:t xml:space="preserve"> Quantidade de </w:t>
-      </w:r>
-      <w:proofErr w:type="spellStart"/>
-      <w:r>
-        <w:rPr>
-          <w:rFonts w:ascii="Arial" w:hAnsi="Arial" w:cs="Arial"/>
-          <w:b/>
-          <w:bCs/>
-          <w:sz w:val="20"/>
-          <w:szCs w:val="20"/>
-        </w:rPr>
-        <w:t>KiloBytes</w:t>
-      </w:r>
-      <w:proofErr w:type="spellEnd"/>
-      <w:r>
-        <w:rPr>
-          <w:rFonts w:ascii="Arial" w:hAnsi="Arial" w:cs="Arial"/>
-          <w:b/>
-          <w:bCs/>
-          <w:sz w:val="20"/>
-          <w:szCs w:val="20"/>
-        </w:rPr>
-        <w:t xml:space="preserve"> Recebidos</w:t>
+        <w:t xml:space="preserve"> Quantidade de KiloBytes Recebidos</w:t>
       </w:r>
     </w:p>
     <w:p>
@@ -6539,29 +6199,7 @@
           <w:sz w:val="20"/>
           <w:szCs w:val="20"/>
         </w:rPr>
-        <w:t xml:space="preserve"> </w:t>
-      </w:r>
-      <w:proofErr w:type="gramStart"/>
-      <w:r>
-        <w:rPr>
-          <w:rFonts w:ascii="Arial" w:hAnsi="Arial" w:cs="Arial"/>
-          <w:b/>
-          <w:bCs/>
-          <w:sz w:val="20"/>
-          <w:szCs w:val="20"/>
-        </w:rPr>
-        <w:t>Disco(</w:t>
-      </w:r>
-      <w:proofErr w:type="gramEnd"/>
-      <w:r>
-        <w:rPr>
-          <w:rFonts w:ascii="Arial" w:hAnsi="Arial" w:cs="Arial"/>
-          <w:b/>
-          <w:bCs/>
-          <w:sz w:val="20"/>
-          <w:szCs w:val="20"/>
-        </w:rPr>
-        <w:t>%)</w:t>
+        <w:t xml:space="preserve"> Disco(%)</w:t>
       </w:r>
     </w:p>
     <w:p>
@@ -6735,29 +6373,7 @@
           <w:sz w:val="20"/>
           <w:szCs w:val="20"/>
         </w:rPr>
-        <w:t xml:space="preserve"> </w:t>
-      </w:r>
-      <w:proofErr w:type="gramStart"/>
-      <w:r>
-        <w:rPr>
-          <w:rFonts w:ascii="Arial" w:hAnsi="Arial" w:cs="Arial"/>
-          <w:b/>
-          <w:bCs/>
-          <w:sz w:val="20"/>
-          <w:szCs w:val="20"/>
-        </w:rPr>
-        <w:t>IOWAIT(</w:t>
-      </w:r>
-      <w:proofErr w:type="gramEnd"/>
-      <w:r>
-        <w:rPr>
-          <w:rFonts w:ascii="Arial" w:hAnsi="Arial" w:cs="Arial"/>
-          <w:b/>
-          <w:bCs/>
-          <w:sz w:val="20"/>
-          <w:szCs w:val="20"/>
-        </w:rPr>
-        <w:t>%)</w:t>
+        <w:t xml:space="preserve"> IOWAIT(%)</w:t>
       </w:r>
     </w:p>
     <w:p>
@@ -6947,20 +6563,8 @@
           <w:szCs w:val="20"/>
         </w:rPr>
         <w:lastRenderedPageBreak/>
-        <w:t xml:space="preserve">Gráfico </w:t>
-      </w:r>
-      <w:proofErr w:type="spellStart"/>
-      <w:r>
-        <w:rPr>
-          <w:rFonts w:ascii="Arial" w:hAnsi="Arial" w:cs="Arial"/>
-          <w:b/>
-          <w:bCs/>
-          <w:sz w:val="20"/>
-          <w:szCs w:val="20"/>
-        </w:rPr>
-        <w:t>BarPlot</w:t>
-      </w:r>
-      <w:proofErr w:type="spellEnd"/>
+        <w:t>Gráfico BarPlot</w:t>
+      </w:r>
       <w:r>
         <w:rPr>
           <w:rFonts w:ascii="Arial" w:hAnsi="Arial" w:cs="Arial"/>
@@ -6994,22 +6598,18 @@
           <w:bCs/>
           <w:sz w:val="20"/>
           <w:szCs w:val="20"/>
-        </w:rPr>
-      </w:pPr>
-      <w:r>
-        <w:rPr>
-          <w:rFonts w:ascii="Arial" w:hAnsi="Arial" w:cs="Arial"/>
-          <w:b/>
-          <w:bCs/>
+          <w:u w:val="single"/>
+        </w:rPr>
+      </w:pPr>
+      <w:r>
+        <w:rPr>
           <w:noProof/>
-          <w:sz w:val="20"/>
-          <w:szCs w:val="20"/>
         </w:rPr>
         <w:drawing>
-          <wp:inline distT="0" distB="0" distL="0" distR="0" wp14:anchorId="661D3F29" wp14:editId="2E1F35CE">
-            <wp:extent cx="5400040" cy="4704715"/>
-            <wp:effectExtent l="0" t="0" r="0" b="635"/>
-            <wp:docPr id="1685940327" name="Imagem 30"/>
+          <wp:inline distT="0" distB="0" distL="0" distR="0" wp14:anchorId="24EF9151" wp14:editId="403209EF">
+            <wp:extent cx="5400040" cy="3217545"/>
+            <wp:effectExtent l="0" t="0" r="0" b="1905"/>
+            <wp:docPr id="722991507" name="Imagem 1"/>
             <wp:cNvGraphicFramePr>
               <a:graphicFrameLocks xmlns:a="http://schemas.openxmlformats.org/drawingml/2006/main" noChangeAspect="1"/>
             </wp:cNvGraphicFramePr>
@@ -7017,8 +6617,10 @@
               <a:graphicData uri="http://schemas.openxmlformats.org/drawingml/2006/picture">
                 <pic:pic xmlns:pic="http://schemas.openxmlformats.org/drawingml/2006/picture">
                   <pic:nvPicPr>
-                    <pic:cNvPr id="1685940327" name="Imagem 1685940327"/>
-                    <pic:cNvPicPr/>
+                    <pic:cNvPr id="0" name="Picture 1"/>
+                    <pic:cNvPicPr>
+                      <a:picLocks noChangeAspect="1" noChangeArrowheads="1"/>
+                    </pic:cNvPicPr>
                   </pic:nvPicPr>
                   <pic:blipFill>
                     <a:blip r:embed="rId30">
@@ -7028,18 +6630,23 @@
                         </a:ext>
                       </a:extLst>
                     </a:blip>
+                    <a:srcRect/>
                     <a:stretch>
                       <a:fillRect/>
                     </a:stretch>
                   </pic:blipFill>
-                  <pic:spPr>
+                  <pic:spPr bwMode="auto">
                     <a:xfrm>
                       <a:off x="0" y="0"/>
-                      <a:ext cx="5400040" cy="4704715"/>
+                      <a:ext cx="5400040" cy="3217545"/>
                     </a:xfrm>
                     <a:prstGeom prst="rect">
                       <a:avLst/>
                     </a:prstGeom>
+                    <a:noFill/>
+                    <a:ln>
+                      <a:noFill/>
+                    </a:ln>
                   </pic:spPr>
                 </pic:pic>
               </a:graphicData>
@@ -7149,7 +6756,6 @@
           <w:sz w:val="24"/>
           <w:szCs w:val="24"/>
         </w:rPr>
-        <w:lastRenderedPageBreak/>
         <w:t>Considerações Finais:</w:t>
       </w:r>
     </w:p>
@@ -7224,6 +6830,7 @@
           <w:sz w:val="24"/>
           <w:szCs w:val="24"/>
         </w:rPr>
+        <w:lastRenderedPageBreak/>
         <w:t>Evidência: Durante o incidente de 16 de março, a CPU atingiu picos de 90% a 99%, o que coincidiu com uma explosão na latência para quase 1 segundo (984ms). Em controle de tráfego aéreo, um atraso desse nível pode significar a perda de sincronia em relatórios de interesse operacional.</w:t>
       </w:r>
     </w:p>
@@ -7404,16 +7011,7 @@
           <w:sz w:val="24"/>
           <w:szCs w:val="24"/>
         </w:rPr>
-        <w:t xml:space="preserve">O objetivo primordial dessas métricas é aumentar o tempo operacional e a confiabilidade da empresa, visto que a estabilidade do hardware é diretamente proporcional à segurança operacional. Ao evitar que o sistema atinja o nível </w:t>
-      </w:r>
-      <w:r>
-        <w:rPr>
-          <w:rFonts w:ascii="Arial" w:hAnsi="Arial" w:cs="Arial"/>
-          <w:sz w:val="24"/>
-          <w:szCs w:val="24"/>
-        </w:rPr>
-        <w:lastRenderedPageBreak/>
-        <w:t>crítico</w:t>
+        <w:t>O objetivo primordial dessas métricas é aumentar o tempo operacional e a confiabilidade da empresa, visto que a estabilidade do hardware é diretamente proporcional à segurança operacional. Ao evitar que o sistema atinja o nível crítico</w:t>
       </w:r>
       <w:r>
         <w:rPr>
@@ -7448,6 +7046,7 @@
           <w:sz w:val="24"/>
           <w:szCs w:val="24"/>
         </w:rPr>
+        <w:lastRenderedPageBreak/>
         <w:t>Em</w:t>
       </w:r>
       <w:r>
@@ -9201,6 +8800,7 @@
   <w:style w:type="character" w:default="1" w:styleId="Fontepargpadro">
     <w:name w:val="Default Paragraph Font"/>
     <w:uiPriority w:val="1"/>
+    <w:semiHidden/>
     <w:unhideWhenUsed/>
   </w:style>
   <w:style w:type="table" w:default="1" w:styleId="Tabelanormal">

</xml_diff>